<commit_message>
B06_collecting_data_over_years found the reason for inagreement of L*f and output: 1.TTL, 2. don't multiply with @ because row names not same, 3. in closed model L*fother not f9
</commit_message>
<xml_diff>
--- a/Bench_Predictions_B/checking f.docx
+++ b/Bench_Predictions_B/checking f.docx
@@ -307,34 +307,13 @@
       </w:r>
     </w:p>
     <w:p>
-      <w:proofErr w:type="spellStart"/>
-      <w:r>
-        <w:t>gdp_long</w:t>
-      </w:r>
-      <w:proofErr w:type="spellEnd"/>
-      <w:r>
-        <w:t>[</w:t>
-      </w:r>
-      <w:proofErr w:type="spellStart"/>
-      <w:r>
-        <w:t>gdp_long.year</w:t>
-      </w:r>
-      <w:proofErr w:type="spellEnd"/>
-      <w:r>
-        <w:t>==2020]</w:t>
-      </w:r>
-    </w:p>
-    <w:p>
-      <w:r>
-        <w:t xml:space="preserve">year country </w:t>
-      </w:r>
-      <w:proofErr w:type="spellStart"/>
-      <w:r>
-        <w:t>gdp</w:t>
-      </w:r>
-      <w:proofErr w:type="spellEnd"/>
-      <w:r>
-        <w:t xml:space="preserve"> total </w:t>
+      <w:r>
+        <w:t>gdp_long[gdp_long.year==2020]</w:t>
+      </w:r>
+    </w:p>
+    <w:p>
+      <w:r>
+        <w:t xml:space="preserve">year country gdp total </w:t>
       </w:r>
     </w:p>
     <w:p>
@@ -374,11 +353,9 @@
     </w:p>
     <w:p/>
     <w:p>
-      <w:proofErr w:type="spellStart"/>
       <w:r>
         <w:t>dfGDP_total</w:t>
       </w:r>
-      <w:proofErr w:type="spellEnd"/>
     </w:p>
     <w:p>
       <w:r>
@@ -424,23 +401,13 @@
     <w:p/>
     <w:p>
       <w:r>
-        <w:t xml:space="preserve">Averages of </w:t>
-      </w:r>
-      <w:proofErr w:type="spellStart"/>
-      <w:r>
-        <w:t>dfother</w:t>
-      </w:r>
-      <w:proofErr w:type="spellEnd"/>
-      <w:r>
-        <w:t xml:space="preserve"> to world bank GDP – average of 2010-2020 and 2020 are very similar</w:t>
-      </w:r>
-    </w:p>
-    <w:p>
-      <w:proofErr w:type="spellStart"/>
+        <w:t>Averages of dfother to world bank GDP – average of 2010-2020 and 2020 are very similar</w:t>
+      </w:r>
+    </w:p>
+    <w:p>
       <w:r>
         <w:t>stats_all</w:t>
       </w:r>
-      <w:proofErr w:type="spellEnd"/>
     </w:p>
     <w:p>
       <w:r>
@@ -454,61 +421,8 @@
     </w:p>
     <w:p>
       <w:r>
-        <w:t xml:space="preserve">country mean std 0 CAN 0.717896 </w:t>
-      </w:r>
-      <w:proofErr w:type="spellStart"/>
-      <w:r>
-        <w:t>NaN</w:t>
-      </w:r>
-      <w:proofErr w:type="spellEnd"/>
-      <w:r>
-        <w:t xml:space="preserve"> 1 DEU 0.772749 </w:t>
-      </w:r>
-      <w:proofErr w:type="spellStart"/>
-      <w:r>
-        <w:t>NaN</w:t>
-      </w:r>
-      <w:proofErr w:type="spellEnd"/>
-      <w:r>
-        <w:t xml:space="preserve"> 2 FRA 0.728518 </w:t>
-      </w:r>
-      <w:proofErr w:type="spellStart"/>
-      <w:r>
-        <w:t>NaN</w:t>
-      </w:r>
-      <w:proofErr w:type="spellEnd"/>
-      <w:r>
-        <w:t xml:space="preserve"> 3 GBR 0.640961 </w:t>
-      </w:r>
-      <w:proofErr w:type="spellStart"/>
-      <w:r>
-        <w:t>NaN</w:t>
-      </w:r>
-      <w:proofErr w:type="spellEnd"/>
-      <w:r>
-        <w:t xml:space="preserve"> 4 ITA 0.646615 </w:t>
-      </w:r>
-      <w:proofErr w:type="spellStart"/>
-      <w:r>
-        <w:t>NaN</w:t>
-      </w:r>
-      <w:proofErr w:type="spellEnd"/>
-      <w:r>
-        <w:t xml:space="preserve"> 5 JPN 0.610107 </w:t>
-      </w:r>
-      <w:proofErr w:type="spellStart"/>
-      <w:r>
-        <w:t>NaN</w:t>
-      </w:r>
-      <w:proofErr w:type="spellEnd"/>
-      <w:r>
-        <w:t xml:space="preserve"> 6 USA 0.485517 </w:t>
-      </w:r>
-      <w:proofErr w:type="spellStart"/>
-      <w:r>
-        <w:t>NaN</w:t>
-      </w:r>
-      <w:proofErr w:type="spellEnd"/>
+        <w:t>country mean std 0 CAN 0.717896 NaN 1 DEU 0.772749 NaN 2 FRA 0.728518 NaN 3 GBR 0.640961 NaN 4 ITA 0.646615 NaN 5 JPN 0.610107 NaN 6 USA 0.485517 NaN</w:t>
+      </w:r>
     </w:p>
     <w:p>
       <w:r>
@@ -519,25 +433,15 @@
     <w:p/>
     <w:p>
       <w:r>
-        <w:t xml:space="preserve">HFCE </w:t>
-      </w:r>
-      <w:proofErr w:type="spellStart"/>
-      <w:r>
-        <w:t>dfv_extrap</w:t>
-      </w:r>
-      <w:proofErr w:type="spellEnd"/>
-    </w:p>
-    <w:p>
-      <w:proofErr w:type="spellStart"/>
+        <w:t>HFCE dfv_extrap</w:t>
+      </w:r>
+    </w:p>
+    <w:p>
       <w:r>
         <w:t>d</w:t>
       </w:r>
       <w:r>
-        <w:t>fv_extrap.loc</w:t>
-      </w:r>
-      <w:proofErr w:type="spellEnd"/>
-      <w:r>
-        <w:t>[2020,:]</w:t>
+        <w:t>fv_extrap.loc[2020,:]</w:t>
       </w:r>
     </w:p>
     <w:p>
@@ -583,13 +487,8 @@
       </w:r>
     </w:p>
     <w:p>
-      <w:proofErr w:type="spellStart"/>
-      <w:r>
-        <w:t>dfv_extrap.loc</w:t>
-      </w:r>
-      <w:proofErr w:type="spellEnd"/>
-      <w:r>
-        <w:t>[2020,:]</w:t>
+      <w:r>
+        <w:t>dfv_extrap.loc[2020,:]</w:t>
       </w:r>
     </w:p>
     <w:p>
@@ -723,13 +622,8 @@
             <w:tcW w:w="4508" w:type="dxa"/>
           </w:tcPr>
           <w:p>
-            <w:proofErr w:type="spellStart"/>
             <w:r>
-              <w:t>dfoutput_total</w:t>
-            </w:r>
-            <w:proofErr w:type="spellEnd"/>
-            <w:r>
-              <w:t>[can, 2019)</w:t>
+              <w:t>dfoutput_total[can, 2019)</w:t>
             </w:r>
           </w:p>
         </w:tc>
@@ -845,8 +739,86 @@
         </w:tc>
       </w:tr>
     </w:tbl>
-    <w:p/>
+    <w:p>
+      <w:pPr>
+        <w:rPr>
+          <w:lang w:val="en-US"/>
+        </w:rPr>
+      </w:pPr>
+    </w:p>
+    <w:p>
+      <w:pPr>
+        <w:rPr>
+          <w:lang w:val="en-US"/>
+        </w:rPr>
+      </w:pPr>
+      <w:r>
+        <w:rPr>
+          <w:lang w:val="en-US"/>
+        </w:rPr>
+        <w:t>Also checked dfHFCE+dfother = df7</w:t>
+      </w:r>
+    </w:p>
+    <w:p>
+      <w:pPr>
+        <w:rPr>
+          <w:lang w:val="en-US"/>
+        </w:rPr>
+      </w:pPr>
+      <w:r>
+        <w:rPr>
+          <w:lang w:val="en-US"/>
+        </w:rPr>
+        <w:t>Accurate for expand as well</w:t>
+      </w:r>
+    </w:p>
+    <w:p>
+      <w:pPr>
+        <w:bidi/>
+        <w:rPr>
+          <w:rFonts w:hint="cs"/>
+          <w:rtl/>
+          <w:lang w:val="en-US"/>
+        </w:rPr>
+      </w:pPr>
+      <w:r>
+        <w:rPr>
+          <w:rFonts w:hint="cs"/>
+          <w:rtl/>
+          <w:lang w:val="en-US"/>
+        </w:rPr>
+        <w:t xml:space="preserve">הבעיה שמצאתי היא שעל </w:t>
+      </w:r>
+      <w:r>
+        <w:rPr>
+          <w:lang w:val="en-US"/>
+        </w:rPr>
+        <w:t>TTL</w:t>
+      </w:r>
+      <w:r>
+        <w:rPr>
+          <w:rFonts w:hint="cs"/>
+          <w:rtl/>
+          <w:lang w:val="en-US"/>
+        </w:rPr>
+        <w:t xml:space="preserve"> המודל לא עובד. עובד על </w:t>
+      </w:r>
+      <w:r>
+        <w:rPr>
+          <w:lang w:val="en-US"/>
+        </w:rPr>
+        <w:t>DOM</w:t>
+      </w:r>
+    </w:p>
+    <w:p>
+      <w:pPr>
+        <w:rPr>
+          <w:lang w:val="en-US"/>
+        </w:rPr>
+      </w:pPr>
+    </w:p>
     <w:sectPr>
+      <w:headerReference w:type="default" r:id="rId6"/>
       <w:pgSz w:w="11906" w:h="16838"/>
       <w:pgMar w:top="1440" w:right="1440" w:bottom="1440" w:left="1440" w:header="708" w:footer="708" w:gutter="0"/>
       <w:cols w:space="708"/>
@@ -854,6 +826,75 @@
     </w:sectPr>
   </w:body>
 </w:document>
+</file>
+
+<file path=word/endnotes.xml><?xml version="1.0" encoding="utf-8"?>
+<w:endnotes xmlns:wpc="http://schemas.microsoft.com/office/word/2010/wordprocessingCanvas" xmlns:cx="http://schemas.microsoft.com/office/drawing/2014/chartex" xmlns:cx1="http://schemas.microsoft.com/office/drawing/2015/9/8/chartex" xmlns:cx2="http://schemas.microsoft.com/office/drawing/2015/10/21/chartex" xmlns:cx3="http://schemas.microsoft.com/office/drawing/2016/5/9/chartex" xmlns:cx4="http://schemas.microsoft.com/office/drawing/2016/5/10/chartex" xmlns:cx5="http://schemas.microsoft.com/office/drawing/2016/5/11/chartex" xmlns:cx6="http://schemas.microsoft.com/office/drawing/2016/5/12/chartex" xmlns:cx7="http://schemas.microsoft.com/office/drawing/2016/5/13/chartex" xmlns:cx8="http://schemas.microsoft.com/office/drawing/2016/5/14/chartex" xmlns:mc="http://schemas.openxmlformats.org/markup-compatibility/2006" xmlns:aink="http://schemas.microsoft.com/office/drawing/2016/ink" xmlns:am3d="http://schemas.microsoft.com/office/drawing/2017/model3d" xmlns:o="urn:schemas-microsoft-com:office:office" xmlns:oel="http://schemas.microsoft.com/office/2019/extlst" xmlns:r="http://schemas.openxmlformats.org/officeDocument/2006/relationships" xmlns:m="http://schemas.openxmlformats.org/officeDocument/2006/math" xmlns:v="urn:schemas-microsoft-com:vml" xmlns:wp14="http://schemas.microsoft.com/office/word/2010/wordprocessingDrawing" xmlns:wp="http://schemas.openxmlformats.org/drawingml/2006/wordprocessingDrawing" xmlns:w10="urn:schemas-microsoft-com:office:word" xmlns:w="http://schemas.openxmlformats.org/wordprocessingml/2006/main" xmlns:w14="http://schemas.microsoft.com/office/word/2010/wordml" xmlns:w15="http://schemas.microsoft.com/office/word/2012/wordml" xmlns:w16cex="http://schemas.microsoft.com/office/word/2018/wordml/cex" xmlns:w16cid="http://schemas.microsoft.com/office/word/2016/wordml/cid" xmlns:w16="http://schemas.microsoft.com/office/word/2018/wordml" xmlns:w16du="http://schemas.microsoft.com/office/word/2023/wordml/word16du" xmlns:w16sdtdh="http://schemas.microsoft.com/office/word/2020/wordml/sdtdatahash" xmlns:w16sdtfl="http://schemas.microsoft.com/office/word/2024/wordml/sdtformatlock" xmlns:w16se="http://schemas.microsoft.com/office/word/2015/wordml/symex" xmlns:wpg="http://schemas.microsoft.com/office/word/2010/wordprocessingGroup" xmlns:wpi="http://schemas.microsoft.com/office/word/2010/wordprocessingInk" xmlns:wne="http://schemas.microsoft.com/office/word/2006/wordml" xmlns:wps="http://schemas.microsoft.com/office/word/2010/wordprocessingShape" mc:Ignorable="w14 w15 w16se w16cid w16 w16cex w16sdtdh w16sdtfl w16du wp14">
+  <w:endnote w:type="separator" w:id="-1">
+    <w:p>
+      <w:pPr>
+        <w:spacing w:after="0" w:line="240" w:lineRule="auto"/>
+      </w:pPr>
+      <w:r>
+        <w:separator/>
+      </w:r>
+    </w:p>
+  </w:endnote>
+  <w:endnote w:type="continuationSeparator" w:id="0">
+    <w:p>
+      <w:pPr>
+        <w:spacing w:after="0" w:line="240" w:lineRule="auto"/>
+      </w:pPr>
+      <w:r>
+        <w:continuationSeparator/>
+      </w:r>
+    </w:p>
+  </w:endnote>
+</w:endnotes>
+</file>
+
+<file path=word/footnotes.xml><?xml version="1.0" encoding="utf-8"?>
+<w:footnotes xmlns:wpc="http://schemas.microsoft.com/office/word/2010/wordprocessingCanvas" xmlns:cx="http://schemas.microsoft.com/office/drawing/2014/chartex" xmlns:cx1="http://schemas.microsoft.com/office/drawing/2015/9/8/chartex" xmlns:cx2="http://schemas.microsoft.com/office/drawing/2015/10/21/chartex" xmlns:cx3="http://schemas.microsoft.com/office/drawing/2016/5/9/chartex" xmlns:cx4="http://schemas.microsoft.com/office/drawing/2016/5/10/chartex" xmlns:cx5="http://schemas.microsoft.com/office/drawing/2016/5/11/chartex" xmlns:cx6="http://schemas.microsoft.com/office/drawing/2016/5/12/chartex" xmlns:cx7="http://schemas.microsoft.com/office/drawing/2016/5/13/chartex" xmlns:cx8="http://schemas.microsoft.com/office/drawing/2016/5/14/chartex" xmlns:mc="http://schemas.openxmlformats.org/markup-compatibility/2006" xmlns:aink="http://schemas.microsoft.com/office/drawing/2016/ink" xmlns:am3d="http://schemas.microsoft.com/office/drawing/2017/model3d" xmlns:o="urn:schemas-microsoft-com:office:office" xmlns:oel="http://schemas.microsoft.com/office/2019/extlst" xmlns:r="http://schemas.openxmlformats.org/officeDocument/2006/relationships" xmlns:m="http://schemas.openxmlformats.org/officeDocument/2006/math" xmlns:v="urn:schemas-microsoft-com:vml" xmlns:wp14="http://schemas.microsoft.com/office/word/2010/wordprocessingDrawing" xmlns:wp="http://schemas.openxmlformats.org/drawingml/2006/wordprocessingDrawing" xmlns:w10="urn:schemas-microsoft-com:office:word" xmlns:w="http://schemas.openxmlformats.org/wordprocessingml/2006/main" xmlns:w14="http://schemas.microsoft.com/office/word/2010/wordml" xmlns:w15="http://schemas.microsoft.com/office/word/2012/wordml" xmlns:w16cex="http://schemas.microsoft.com/office/word/2018/wordml/cex" xmlns:w16cid="http://schemas.microsoft.com/office/word/2016/wordml/cid" xmlns:w16="http://schemas.microsoft.com/office/word/2018/wordml" xmlns:w16du="http://schemas.microsoft.com/office/word/2023/wordml/word16du" xmlns:w16sdtdh="http://schemas.microsoft.com/office/word/2020/wordml/sdtdatahash" xmlns:w16sdtfl="http://schemas.microsoft.com/office/word/2024/wordml/sdtformatlock" xmlns:w16se="http://schemas.microsoft.com/office/word/2015/wordml/symex" xmlns:wpg="http://schemas.microsoft.com/office/word/2010/wordprocessingGroup" xmlns:wpi="http://schemas.microsoft.com/office/word/2010/wordprocessingInk" xmlns:wne="http://schemas.microsoft.com/office/word/2006/wordml" xmlns:wps="http://schemas.microsoft.com/office/word/2010/wordprocessingShape" mc:Ignorable="w14 w15 w16se w16cid w16 w16cex w16sdtdh w16sdtfl w16du wp14">
+  <w:footnote w:type="separator" w:id="-1">
+    <w:p>
+      <w:pPr>
+        <w:spacing w:after="0" w:line="240" w:lineRule="auto"/>
+      </w:pPr>
+      <w:r>
+        <w:separator/>
+      </w:r>
+    </w:p>
+  </w:footnote>
+  <w:footnote w:type="continuationSeparator" w:id="0">
+    <w:p>
+      <w:pPr>
+        <w:spacing w:after="0" w:line="240" w:lineRule="auto"/>
+      </w:pPr>
+      <w:r>
+        <w:continuationSeparator/>
+      </w:r>
+    </w:p>
+  </w:footnote>
+</w:footnotes>
+</file>
+
+<file path=word/header1.xml><?xml version="1.0" encoding="utf-8"?>
+<w:hdr xmlns:wpc="http://schemas.microsoft.com/office/word/2010/wordprocessingCanvas" xmlns:cx="http://schemas.microsoft.com/office/drawing/2014/chartex" xmlns:cx1="http://schemas.microsoft.com/office/drawing/2015/9/8/chartex" xmlns:cx2="http://schemas.microsoft.com/office/drawing/2015/10/21/chartex" xmlns:cx3="http://schemas.microsoft.com/office/drawing/2016/5/9/chartex" xmlns:cx4="http://schemas.microsoft.com/office/drawing/2016/5/10/chartex" xmlns:cx5="http://schemas.microsoft.com/office/drawing/2016/5/11/chartex" xmlns:cx6="http://schemas.microsoft.com/office/drawing/2016/5/12/chartex" xmlns:cx7="http://schemas.microsoft.com/office/drawing/2016/5/13/chartex" xmlns:cx8="http://schemas.microsoft.com/office/drawing/2016/5/14/chartex" xmlns:mc="http://schemas.openxmlformats.org/markup-compatibility/2006" xmlns:aink="http://schemas.microsoft.com/office/drawing/2016/ink" xmlns:am3d="http://schemas.microsoft.com/office/drawing/2017/model3d" xmlns:o="urn:schemas-microsoft-com:office:office" xmlns:oel="http://schemas.microsoft.com/office/2019/extlst" xmlns:r="http://schemas.openxmlformats.org/officeDocument/2006/relationships" xmlns:m="http://schemas.openxmlformats.org/officeDocument/2006/math" xmlns:v="urn:schemas-microsoft-com:vml" xmlns:wp14="http://schemas.microsoft.com/office/word/2010/wordprocessingDrawing" xmlns:wp="http://schemas.openxmlformats.org/drawingml/2006/wordprocessingDrawing" xmlns:w10="urn:schemas-microsoft-com:office:word" xmlns:w="http://schemas.openxmlformats.org/wordprocessingml/2006/main" xmlns:w14="http://schemas.microsoft.com/office/word/2010/wordml" xmlns:w15="http://schemas.microsoft.com/office/word/2012/wordml" xmlns:w16cex="http://schemas.microsoft.com/office/word/2018/wordml/cex" xmlns:w16cid="http://schemas.microsoft.com/office/word/2016/wordml/cid" xmlns:w16="http://schemas.microsoft.com/office/word/2018/wordml" xmlns:w16du="http://schemas.microsoft.com/office/word/2023/wordml/word16du" xmlns:w16sdtdh="http://schemas.microsoft.com/office/word/2020/wordml/sdtdatahash" xmlns:w16sdtfl="http://schemas.microsoft.com/office/word/2024/wordml/sdtformatlock" xmlns:w16se="http://schemas.microsoft.com/office/word/2015/wordml/symex" xmlns:wpg="http://schemas.microsoft.com/office/word/2010/wordprocessingGroup" xmlns:wpi="http://schemas.microsoft.com/office/word/2010/wordprocessingInk" xmlns:wne="http://schemas.microsoft.com/office/word/2006/wordml" xmlns:wps="http://schemas.microsoft.com/office/word/2010/wordprocessingShape" mc:Ignorable="w14 w15 w16se w16cid w16 w16cex w16sdtdh w16sdtfl w16du wp14">
+  <w:p>
+    <w:pPr>
+      <w:pStyle w:val="Header"/>
+      <w:rPr>
+        <w:lang w:val="en-US"/>
+      </w:rPr>
+    </w:pPr>
+    <w:r>
+      <w:rPr>
+        <w:lang w:val="en-US"/>
+      </w:rPr>
+      <w:t>v</w:t>
+    </w:r>
+  </w:p>
+</w:hdr>
 </file>
 
 <file path=word/styles.xml><?xml version="1.0" encoding="utf-8"?>
@@ -1789,6 +1830,50 @@
       </w:tblBorders>
     </w:tblPr>
   </w:style>
+  <w:style w:type="paragraph" w:styleId="Header">
+    <w:name w:val="header"/>
+    <w:basedOn w:val="Normal"/>
+    <w:link w:val="HeaderChar"/>
+    <w:uiPriority w:val="99"/>
+    <w:unhideWhenUsed/>
+    <w:rsid w:val="009E5E70"/>
+    <w:pPr>
+      <w:tabs>
+        <w:tab w:val="center" w:pos="4513"/>
+        <w:tab w:val="right" w:pos="9026"/>
+      </w:tabs>
+      <w:spacing w:after="0" w:line="240" w:lineRule="auto"/>
+    </w:pPr>
+  </w:style>
+  <w:style w:type="character" w:customStyle="1" w:styleId="HeaderChar">
+    <w:name w:val="Header Char"/>
+    <w:basedOn w:val="DefaultParagraphFont"/>
+    <w:link w:val="Header"/>
+    <w:uiPriority w:val="99"/>
+    <w:rsid w:val="009E5E70"/>
+  </w:style>
+  <w:style w:type="paragraph" w:styleId="Footer">
+    <w:name w:val="footer"/>
+    <w:basedOn w:val="Normal"/>
+    <w:link w:val="FooterChar"/>
+    <w:uiPriority w:val="99"/>
+    <w:unhideWhenUsed/>
+    <w:rsid w:val="009E5E70"/>
+    <w:pPr>
+      <w:tabs>
+        <w:tab w:val="center" w:pos="4513"/>
+        <w:tab w:val="right" w:pos="9026"/>
+      </w:tabs>
+      <w:spacing w:after="0" w:line="240" w:lineRule="auto"/>
+    </w:pPr>
+  </w:style>
+  <w:style w:type="character" w:customStyle="1" w:styleId="FooterChar">
+    <w:name w:val="Footer Char"/>
+    <w:basedOn w:val="DefaultParagraphFont"/>
+    <w:link w:val="Footer"/>
+    <w:uiPriority w:val="99"/>
+    <w:rsid w:val="009E5E70"/>
+  </w:style>
 </w:styles>
 </file>
 

</xml_diff>

<commit_message>
graph1_check_Shares - checking the shares calculationg and graph (graph1,2)
</commit_message>
<xml_diff>
--- a/Bench_Predictions_B/checking f.docx
+++ b/Bench_Predictions_B/checking f.docx
@@ -776,32 +776,79 @@
       <w:pPr>
         <w:bidi/>
         <w:rPr>
+          <w:rtl/>
+          <w:lang w:val="en-US"/>
+        </w:rPr>
+      </w:pPr>
+      <w:r>
+        <w:rPr>
           <w:rFonts w:hint="cs"/>
           <w:rtl/>
           <w:lang w:val="en-US"/>
         </w:rPr>
-      </w:pPr>
+        <w:t xml:space="preserve">הבעיה שמצאתי היא שעל </w:t>
+      </w:r>
+      <w:r>
+        <w:rPr>
+          <w:lang w:val="en-US"/>
+        </w:rPr>
+        <w:t>TTL</w:t>
+      </w:r>
       <w:r>
         <w:rPr>
           <w:rFonts w:hint="cs"/>
           <w:rtl/>
           <w:lang w:val="en-US"/>
         </w:rPr>
-        <w:t xml:space="preserve">הבעיה שמצאתי היא שעל </w:t>
-      </w:r>
-      <w:r>
-        <w:rPr>
-          <w:lang w:val="en-US"/>
-        </w:rPr>
-        <w:t>TTL</w:t>
-      </w:r>
+        <w:t xml:space="preserve"> המודל לא עובד. עובד על </w:t>
+      </w:r>
+      <w:r>
+        <w:rPr>
+          <w:lang w:val="en-US"/>
+        </w:rPr>
+        <w:t>DOM</w:t>
+      </w:r>
+    </w:p>
+    <w:p>
+      <w:pPr>
+        <w:bidi/>
+      </w:pPr>
+      <w:r>
+        <w:t>[Errno 2] No such file or directory: '../Data/NATIODOMIMP/USA2020dom.csv'</w:t>
+      </w:r>
+    </w:p>
+    <w:p>
+      <w:pPr>
+        <w:bidi/>
+        <w:rPr>
+          <w:rtl/>
+          <w:lang w:val="en-US"/>
+        </w:rPr>
+      </w:pPr>
       <w:r>
         <w:rPr>
           <w:rFonts w:hint="cs"/>
           <w:rtl/>
           <w:lang w:val="en-US"/>
         </w:rPr>
-        <w:t xml:space="preserve"> המודל לא עובד. עובד על </w:t>
+        <w:t>הנה מה שקרה:</w:t>
+      </w:r>
+    </w:p>
+    <w:p>
+      <w:pPr>
+        <w:bidi/>
+        <w:rPr>
+          <w:rtl/>
+          <w:lang w:val="en-US"/>
+        </w:rPr>
+      </w:pPr>
+      <w:r>
+        <w:rPr>
+          <w:rFonts w:hint="cs"/>
+          <w:rtl/>
+          <w:lang w:val="en-US"/>
+        </w:rPr>
+        <w:t xml:space="preserve">התורה של לאונטיף אפליקטיבית רק כשמדובר על </w:t>
       </w:r>
       <w:r>
         <w:rPr>
@@ -809,6 +856,174 @@
         </w:rPr>
         <w:t>DOM</w:t>
       </w:r>
+      <w:r>
+        <w:rPr>
+          <w:rFonts w:hint="cs"/>
+          <w:rtl/>
+          <w:lang w:val="en-US"/>
+        </w:rPr>
+        <w:t>. צריך שוק סגור</w:t>
+      </w:r>
+    </w:p>
+    <w:p>
+      <w:pPr>
+        <w:bidi/>
+        <w:rPr>
+          <w:rtl/>
+          <w:lang w:val="en-US"/>
+        </w:rPr>
+      </w:pPr>
+      <w:r>
+        <w:rPr>
+          <w:rFonts w:hint="cs"/>
+          <w:rtl/>
+          <w:lang w:val="en-US"/>
+        </w:rPr>
+        <w:t>אי אפשר להכניס אימפורטס לשם, אם נכניס אימפורטס</w:t>
+      </w:r>
+    </w:p>
+    <w:p>
+      <w:pPr>
+        <w:rPr>
+          <w:lang w:val="en-US"/>
+        </w:rPr>
+      </w:pPr>
+      <w:r>
+        <w:rPr>
+          <w:lang w:val="en-US"/>
+        </w:rPr>
+        <w:t>DOM – effects confied to local economy</w:t>
+      </w:r>
+    </w:p>
+    <w:p>
+      <w:pPr>
+        <w:rPr>
+          <w:lang w:val="en-US"/>
+        </w:rPr>
+      </w:pPr>
+      <w:r>
+        <w:rPr>
+          <w:lang w:val="en-US"/>
+        </w:rPr>
+        <w:t>TTL = domestic + imports – I compute total production requirements</w:t>
+      </w:r>
+    </w:p>
+    <w:p>
+      <w:pPr>
+        <w:rPr>
+          <w:lang w:val="en-US"/>
+        </w:rPr>
+      </w:pPr>
+      <w:r>
+        <w:rPr>
+          <w:lang w:val="en-US"/>
+        </w:rPr>
+        <w:t>Miller:</w:t>
+      </w:r>
+    </w:p>
+    <w:p>
+      <w:r>
+        <w:t>The Leontief inverse can be computed using total input coefficients, which measure total (domestic plus imported) input requirements.</w:t>
+      </w:r>
+      <w:r>
+        <w:br/>
+        <w:t>However, such an inverse represents total global production requirements, not the domestic production response.”</w:t>
+      </w:r>
+    </w:p>
+    <w:p>
+      <w:r>
+        <w:t>and</w:t>
+      </w:r>
+    </w:p>
+    <w:p>
+      <w:r>
+        <w:t>“When using the total-use table, the Leontief model remains algebraically valid, but the interpretation changes — the inverse shows total output required worldwide to meet one unit of final demand, including imported intermediate inputs.”</w:t>
+      </w:r>
+    </w:p>
+    <w:p/>
+    <w:p>
+      <w:pPr>
+        <w:bidi/>
+        <w:rPr>
+          <w:rtl/>
+          <w:lang w:val="en-US"/>
+        </w:rPr>
+      </w:pPr>
+    </w:p>
+    <w:p>
+      <w:pPr>
+        <w:rPr>
+          <w:rFonts w:hint="cs"/>
+          <w:rtl/>
+          <w:lang w:val="en-US"/>
+        </w:rPr>
+      </w:pPr>
+      <w:r>
+        <w:rPr>
+          <w:rFonts w:hint="cs"/>
+          <w:rtl/>
+          <w:lang w:val="en-US"/>
+        </w:rPr>
+        <w:t>23.10.25</w:t>
+      </w:r>
+    </w:p>
+    <w:p>
+      <w:pPr>
+        <w:rPr>
+          <w:lang w:val="en-US"/>
+        </w:rPr>
+      </w:pPr>
+      <w:r>
+        <w:rPr>
+          <w:rFonts w:hint="cs"/>
+          <w:rtl/>
+          <w:lang w:val="en-US"/>
+        </w:rPr>
+        <w:t xml:space="preserve"> </w:t>
+      </w:r>
+      <w:r>
+        <w:rPr>
+          <w:lang w:val="en-US"/>
+        </w:rPr>
+        <w:t>The mistake was using TTL instead of DOM</w:t>
+      </w:r>
+    </w:p>
+    <w:p>
+      <w:pPr>
+        <w:bidi/>
+        <w:rPr>
+          <w:rtl/>
+          <w:lang w:val="en-US"/>
+        </w:rPr>
+      </w:pPr>
+    </w:p>
+    <w:p>
+      <w:pPr>
+        <w:bidi/>
+        <w:rPr>
+          <w:rtl/>
+          <w:lang w:val="en-US"/>
+        </w:rPr>
+      </w:pPr>
+    </w:p>
+    <w:p>
+      <w:pPr>
+        <w:bidi/>
+        <w:rPr>
+          <w:rtl/>
+          <w:lang w:val="en-US"/>
+        </w:rPr>
+      </w:pPr>
+    </w:p>
+    <w:p>
+      <w:pPr>
+        <w:bidi/>
+        <w:rPr>
+          <w:rFonts w:hint="cs"/>
+          <w:rtl/>
+          <w:lang w:val="en-US"/>
+        </w:rPr>
+      </w:pPr>
     </w:p>
     <w:p>
       <w:pPr>

</xml_diff>